<commit_message>
Refresh launch instruction email document
</commit_message>
<xml_diff>
--- a/05_Dokumentacja/Email_instrukcja_uruchomienia_Nowa_Energia.docx
+++ b/05_Dokumentacja/Email_instrukcja_uruchomienia_Nowa_Energia.docx
@@ -72,15 +72,7 @@
         <w:ind w:left="360" w:hanging="180"/>
       </w:pPr>
       <w:r>
-        <w:t xml:space="preserve">• </w:t>
-      </w:r>
-      <w:proofErr w:type="spellStart"/>
-      <w:r>
-        <w:t>Python</w:t>
-      </w:r>
-      <w:proofErr w:type="spellEnd"/>
-      <w:r>
-        <w:t xml:space="preserve"> 3.11 lub nowszy.</w:t>
+        <w:t>• Python 3.11 lub nowszy.</w:t>
       </w:r>
     </w:p>
     <w:p>
@@ -98,23 +90,7 @@
         <w:ind w:left="360" w:hanging="180"/>
       </w:pPr>
       <w:r>
-        <w:t xml:space="preserve">• Dostęp do terminala PowerShell lub </w:t>
-      </w:r>
-      <w:proofErr w:type="spellStart"/>
-      <w:r>
-        <w:t>Command</w:t>
-      </w:r>
-      <w:proofErr w:type="spellEnd"/>
-      <w:r>
-        <w:t xml:space="preserve"> </w:t>
-      </w:r>
-      <w:proofErr w:type="spellStart"/>
-      <w:r>
-        <w:t>Prompt</w:t>
-      </w:r>
-      <w:proofErr w:type="spellEnd"/>
-      <w:r>
-        <w:t>.</w:t>
+        <w:t>• Dostęp do terminala PowerShell lub Command Prompt.</w:t>
       </w:r>
     </w:p>
     <w:p>
@@ -149,92 +125,34 @@
         <w:ind w:left="360" w:hanging="180"/>
       </w:pPr>
       <w:r>
-        <w:t xml:space="preserve">• Utwórz środowisko: </w:t>
-      </w:r>
-      <w:proofErr w:type="spellStart"/>
-      <w:r>
-        <w:t>python</w:t>
-      </w:r>
-      <w:proofErr w:type="spellEnd"/>
-      <w:r>
-        <w:t xml:space="preserve"> -m </w:t>
-      </w:r>
-      <w:proofErr w:type="spellStart"/>
-      <w:r>
-        <w:t>venv</w:t>
-      </w:r>
-      <w:proofErr w:type="spellEnd"/>
-      <w:r>
-        <w:t xml:space="preserve"> .</w:t>
-      </w:r>
-      <w:proofErr w:type="spellStart"/>
-      <w:r>
-        <w:t>venv</w:t>
-      </w:r>
-      <w:proofErr w:type="spellEnd"/>
-    </w:p>
-    <w:p>
-      <w:pPr>
-        <w:spacing w:after="80"/>
-        <w:ind w:left="360" w:hanging="180"/>
-      </w:pPr>
-      <w:r>
-        <w:t>• Aktywuj środowisko: .</w:t>
-      </w:r>
-      <w:proofErr w:type="spellStart"/>
-      <w:r>
-        <w:t>venv</w:t>
-      </w:r>
-      <w:proofErr w:type="spellEnd"/>
-      <w:r>
-        <w:t>\Scripts\</w:t>
-      </w:r>
-      <w:proofErr w:type="spellStart"/>
-      <w:r>
-        <w:t>activate</w:t>
-      </w:r>
-      <w:proofErr w:type="spellEnd"/>
-    </w:p>
-    <w:p>
-      <w:pPr>
-        <w:spacing w:after="80"/>
-        <w:ind w:left="360" w:hanging="180"/>
-      </w:pPr>
-      <w:r>
-        <w:t xml:space="preserve">• Zainstaluj zależności: pip </w:t>
-      </w:r>
-      <w:proofErr w:type="spellStart"/>
-      <w:r>
-        <w:t>install</w:t>
-      </w:r>
-      <w:proofErr w:type="spellEnd"/>
-      <w:r>
-        <w:t xml:space="preserve"> -r requirements.txt</w:t>
-      </w:r>
-    </w:p>
-    <w:p>
-      <w:pPr>
-        <w:spacing w:after="80"/>
-        <w:ind w:left="360" w:hanging="180"/>
-      </w:pPr>
-      <w:r>
-        <w:t xml:space="preserve">• Uruchom aplikację: </w:t>
-      </w:r>
-      <w:proofErr w:type="spellStart"/>
-      <w:r>
-        <w:t>python</w:t>
-      </w:r>
-      <w:proofErr w:type="spellEnd"/>
-      <w:r>
-        <w:t xml:space="preserve"> -m </w:t>
-      </w:r>
-      <w:proofErr w:type="spellStart"/>
-      <w:r>
-        <w:t>streamlit</w:t>
-      </w:r>
-      <w:proofErr w:type="spellEnd"/>
-      <w:r>
-        <w:t xml:space="preserve"> run app.py</w:t>
+        <w:t>• Utwórz środowisko: python -m venv .venv</w:t>
+      </w:r>
+    </w:p>
+    <w:p>
+      <w:pPr>
+        <w:spacing w:after="80"/>
+        <w:ind w:left="360" w:hanging="180"/>
+      </w:pPr>
+      <w:r>
+        <w:t>• Aktywuj środowisko: .venv\Scripts\activate</w:t>
+      </w:r>
+    </w:p>
+    <w:p>
+      <w:pPr>
+        <w:spacing w:after="80"/>
+        <w:ind w:left="360" w:hanging="180"/>
+      </w:pPr>
+      <w:r>
+        <w:t>• Zainstaluj zależności: pip install -r requirements.txt</w:t>
+      </w:r>
+    </w:p>
+    <w:p>
+      <w:pPr>
+        <w:spacing w:after="80"/>
+        <w:ind w:left="360" w:hanging="180"/>
+      </w:pPr>
+      <w:r>
+        <w:t>• Uruchom aplikację: python -m streamlit run app.py</w:t>
       </w:r>
     </w:p>
     <w:p>
@@ -289,7 +207,16 @@
         <w:t>Po wgraniu danych należy uruchomić planowanie, zweryfikować propozycję, zatwierdzić harmonogram, a następnie obsługiwać awarie i statusy wykonania prac.</w:t>
       </w:r>
       <w:r>
-        <w:t xml:space="preserve"> W aplikacji  </w:t>
+        <w:t xml:space="preserve"> W aplikacji </w:t>
+      </w:r>
+      <w:r>
+        <w:t xml:space="preserve">dostępne jest szkolenie „interaktywne” </w:t>
+      </w:r>
+      <w:r>
+        <w:rPr>
+          <w:rFonts w:ascii="Segoe UI Emoji" w:eastAsia="Segoe UI Emoji" w:hAnsi="Segoe UI Emoji" w:cs="Segoe UI Emoji"/>
+        </w:rPr>
+        <w:t>😉</w:t>
       </w:r>
     </w:p>
     <w:p>

</xml_diff>